<commit_message>
feat: implementasi fitur evaluasi (quiz + feedback)
</commit_message>
<xml_diff>
--- a/docs/Time Line RENJANA.docx
+++ b/docs/Time Line RENJANA.docx
@@ -2208,16 +2208,7 @@
           <w:szCs w:val="24"/>
           <w:lang w:val="id-ID"/>
         </w:rPr>
-        <w:t xml:space="preserve">Dasboard </w:t>
-      </w:r>
-      <w:r>
-        <w:rPr>
-          <w:noProof/>
-          <w:sz w:val="24"/>
-          <w:szCs w:val="24"/>
-          <w:lang w:val="id-ID"/>
-        </w:rPr>
-        <w:t>Admin</w:t>
+        <w:t>Dasboard Admin</w:t>
       </w:r>
     </w:p>
     <w:p>
@@ -2519,6 +2510,32 @@
         </w:rPr>
         <w:lastRenderedPageBreak/>
         <w:t>Materi dan flayer kegiatan Webinar sebagai sarana di website coba dibuat contohnya mas yudi, daftar peserta dan absensi langsung ada sertifikatnya.</w:t>
+      </w:r>
+    </w:p>
+    <w:p>
+      <w:pPr>
+        <w:pStyle w:val="ListParagraph"/>
+        <w:numPr>
+          <w:ilvl w:val="0"/>
+          <w:numId w:val="2"/>
+        </w:numPr>
+        <w:rPr>
+          <w:rFonts w:cstheme="minorHAnsi"/>
+          <w:noProof/>
+          <w:sz w:val="24"/>
+          <w:szCs w:val="24"/>
+          <w:lang w:val="id-ID"/>
+        </w:rPr>
+      </w:pPr>
+      <w:r>
+        <w:rPr>
+          <w:rFonts w:cstheme="minorHAnsi"/>
+          <w:noProof/>
+          <w:sz w:val="24"/>
+          <w:szCs w:val="24"/>
+          <w:lang w:val="id-ID"/>
+        </w:rPr>
+        <w:t>Daftar-presensi-evaluasi-sertifikat</w:t>
       </w:r>
     </w:p>
     <w:p>
@@ -2675,7 +2692,7 @@
       <w:lvlText w:val="%1."/>
       <w:lvlJc w:val="left"/>
       <w:pPr>
-        <w:ind w:left="1440" w:hanging="360"/>
+        <w:ind w:left="2250" w:hanging="360"/>
       </w:pPr>
     </w:lvl>
     <w:lvl w:ilvl="1" w:tplc="04090019" w:tentative="1">
@@ -2684,7 +2701,7 @@
       <w:lvlText w:val="%2."/>
       <w:lvlJc w:val="left"/>
       <w:pPr>
-        <w:ind w:left="2160" w:hanging="360"/>
+        <w:ind w:left="2970" w:hanging="360"/>
       </w:pPr>
     </w:lvl>
     <w:lvl w:ilvl="2" w:tplc="0409001B" w:tentative="1">
@@ -2693,7 +2710,7 @@
       <w:lvlText w:val="%3."/>
       <w:lvlJc w:val="right"/>
       <w:pPr>
-        <w:ind w:left="2880" w:hanging="180"/>
+        <w:ind w:left="3690" w:hanging="180"/>
       </w:pPr>
     </w:lvl>
     <w:lvl w:ilvl="3" w:tplc="0409000F" w:tentative="1">
@@ -2702,7 +2719,7 @@
       <w:lvlText w:val="%4."/>
       <w:lvlJc w:val="left"/>
       <w:pPr>
-        <w:ind w:left="3600" w:hanging="360"/>
+        <w:ind w:left="4410" w:hanging="360"/>
       </w:pPr>
     </w:lvl>
     <w:lvl w:ilvl="4" w:tplc="04090019" w:tentative="1">
@@ -2711,7 +2728,7 @@
       <w:lvlText w:val="%5."/>
       <w:lvlJc w:val="left"/>
       <w:pPr>
-        <w:ind w:left="4320" w:hanging="360"/>
+        <w:ind w:left="5130" w:hanging="360"/>
       </w:pPr>
     </w:lvl>
     <w:lvl w:ilvl="5" w:tplc="0409001B" w:tentative="1">
@@ -2720,7 +2737,7 @@
       <w:lvlText w:val="%6."/>
       <w:lvlJc w:val="right"/>
       <w:pPr>
-        <w:ind w:left="5040" w:hanging="180"/>
+        <w:ind w:left="5850" w:hanging="180"/>
       </w:pPr>
     </w:lvl>
     <w:lvl w:ilvl="6" w:tplc="0409000F" w:tentative="1">
@@ -2729,7 +2746,7 @@
       <w:lvlText w:val="%7."/>
       <w:lvlJc w:val="left"/>
       <w:pPr>
-        <w:ind w:left="5760" w:hanging="360"/>
+        <w:ind w:left="6570" w:hanging="360"/>
       </w:pPr>
     </w:lvl>
     <w:lvl w:ilvl="7" w:tplc="04090019" w:tentative="1">
@@ -2738,7 +2755,7 @@
       <w:lvlText w:val="%8."/>
       <w:lvlJc w:val="left"/>
       <w:pPr>
-        <w:ind w:left="6480" w:hanging="360"/>
+        <w:ind w:left="7290" w:hanging="360"/>
       </w:pPr>
     </w:lvl>
     <w:lvl w:ilvl="8" w:tplc="0409001B" w:tentative="1">
@@ -2747,7 +2764,7 @@
       <w:lvlText w:val="%9."/>
       <w:lvlJc w:val="right"/>
       <w:pPr>
-        <w:ind w:left="7200" w:hanging="180"/>
+        <w:ind w:left="8010" w:hanging="180"/>
       </w:pPr>
     </w:lvl>
   </w:abstractNum>

</xml_diff>